<commit_message>
Apply 1-year car rental (50/month, no deposit, single car) to plan v11, approval docx and attachment
Co-Authored-By: Claude Opus 5.5 <noreply@anthropic.com>
Claude-Session: https://claude.ai/code/session_01SrTScNKmsHS34birk48N5j
</commit_message>
<xml_diff>
--- a/output/changwon_budget_request.docx
+++ b/output/changwon_budget_request.docx
@@ -1052,7 +1052,7 @@
           <w:sz w:val="22"/>
           <w:szCs w:val="22"/>
         </w:rPr>
-        <w:t xml:space="preserve">ㅇ 2027년: 수석 엔지니어 1인 추가 파견(1/4분기) + 현지 채용 3인, 차량 2대</w:t>
+        <w:t xml:space="preserve">ㅇ 2027년: 수석 엔지니어 1인 추가 파견(1/4분기) + 현지 채용 3인, 차량 1대 유지(추가 렌트 없음)</w:t>
       </w:r>
     </w:p>
     <w:p>
@@ -1108,7 +1108,7 @@
           <w:sz w:val="22"/>
           <w:szCs w:val="22"/>
         </w:rPr>
-        <w:t xml:space="preserve">2026년 집행 예산 : 2,863만 원 (비용) + 보증금 6,252만 원 (반환 자산)</w:t>
+        <w:t xml:space="preserve">2026년 집행 예산 : 2,891만 원 (비용) + 보증금 5,352만 원 (반환 자산)</w:t>
       </w:r>
     </w:p>
     <w:p>
@@ -1122,7 +1122,7 @@
           <w:sz w:val="22"/>
           <w:szCs w:val="22"/>
         </w:rPr>
-        <w:t xml:space="preserve">ㅇ 일회성 초기 투자 1,943만 원 + 11~12월 운영비 920만 원</w:t>
+        <w:t xml:space="preserve">ㅇ 일회성 초기 투자 1,943만 원 + 11~12월 운영비 948만 원</w:t>
       </w:r>
     </w:p>
     <w:p>
@@ -1136,7 +1136,7 @@
           <w:sz w:val="22"/>
           <w:szCs w:val="22"/>
         </w:rPr>
-        <w:t xml:space="preserve">ㅇ 2026년 현금 소요 합계 9,115만 원 (2026.11 입주 시점 집중)</w:t>
+        <w:t xml:space="preserve">ㅇ 2026년 현금 소요 합계 8,243만 원 (2026.11 입주 시점 집중)</w:t>
       </w:r>
     </w:p>
     <w:p>
@@ -1162,7 +1162,7 @@
           <w:sz w:val="22"/>
           <w:szCs w:val="22"/>
         </w:rPr>
-        <w:t xml:space="preserve">2027년 운영 예산 편성 : 연 7,447만 원</w:t>
+        <w:t xml:space="preserve">2027년 운영 예산 편성 : 연 6,823만 원</w:t>
       </w:r>
     </w:p>
     <w:p>
@@ -1176,7 +1176,7 @@
           <w:sz w:val="22"/>
           <w:szCs w:val="22"/>
         </w:rPr>
-        <w:t xml:space="preserve">ㅇ 출장비 절감 1,978만 원 반영 시 운영비 순증 5,469만 원</w:t>
+        <w:t xml:space="preserve">ㅇ 출장비 절감 1,978만 원 반영 시 운영비 순증 4,845만 원</w:t>
       </w:r>
     </w:p>
     <w:p>
@@ -1190,7 +1190,7 @@
           <w:sz w:val="22"/>
           <w:szCs w:val="22"/>
         </w:rPr>
-        <w:t xml:space="preserve">ㅇ 차량 렌트 보증금 추가 1대분 최대 900만 원 (반환 자산)</w:t>
+        <w:t xml:space="preserve">ㅇ 차량은 1년 렌트 계약(월 50만 원, 보증금 없음)으로 1대 운영 — 2027 추가 렌트 없음</w:t>
       </w:r>
     </w:p>
     <w:p>
@@ -2359,7 +2359,7 @@
                 <w:sz w:val="19"/>
                 <w:szCs w:val="19"/>
               </w:rPr>
-              <w:t xml:space="preserve">132</w:t>
+              <w:t xml:space="preserve">160</w:t>
             </w:r>
           </w:p>
         </w:tc>
@@ -2391,7 +2391,7 @@
                 <w:sz w:val="19"/>
                 <w:szCs w:val="19"/>
               </w:rPr>
-              <w:t xml:space="preserve">1,584</w:t>
+              <w:t xml:space="preserve">960</w:t>
             </w:r>
           </w:p>
         </w:tc>
@@ -2423,7 +2423,7 @@
                 <w:sz w:val="19"/>
                 <w:szCs w:val="19"/>
               </w:rPr>
-              <w:t xml:space="preserve">1대 → 2대</w:t>
+              <w:t xml:space="preserve">렌트 50 + 운영 30 · 1대</w:t>
             </w:r>
           </w:p>
         </w:tc>
@@ -2664,7 +2664,7 @@
                 <w:sz w:val="19"/>
                 <w:szCs w:val="19"/>
               </w:rPr>
-              <w:t xml:space="preserve">2,863</w:t>
+              <w:t xml:space="preserve">2,891</w:t>
             </w:r>
           </w:p>
         </w:tc>
@@ -2699,7 +2699,7 @@
                 <w:sz w:val="19"/>
                 <w:szCs w:val="19"/>
               </w:rPr>
-              <w:t xml:space="preserve">7,447</w:t>
+              <w:t xml:space="preserve">6,823</w:t>
             </w:r>
           </w:p>
         </w:tc>
@@ -2940,7 +2940,7 @@
                 <w:sz w:val="19"/>
                 <w:szCs w:val="19"/>
               </w:rPr>
-              <w:t xml:space="preserve">755</w:t>
+              <w:t xml:space="preserve">783</w:t>
             </w:r>
           </w:p>
         </w:tc>
@@ -2974,7 +2974,7 @@
                 <w:sz w:val="19"/>
                 <w:szCs w:val="19"/>
               </w:rPr>
-              <w:t xml:space="preserve">5,469</w:t>
+              <w:t xml:space="preserve">4,845</w:t>
             </w:r>
           </w:p>
         </w:tc>
@@ -3076,7 +3076,7 @@
                 <w:sz w:val="19"/>
                 <w:szCs w:val="19"/>
               </w:rPr>
-              <w:t xml:space="preserve">6,252</w:t>
+              <w:t xml:space="preserve">5,352</w:t>
             </w:r>
           </w:p>
         </w:tc>
@@ -3108,7 +3108,7 @@
                 <w:sz w:val="19"/>
                 <w:szCs w:val="19"/>
               </w:rPr>
-              <w:t xml:space="preserve">900</w:t>
+              <w:t xml:space="preserve">–</w:t>
             </w:r>
           </w:p>
         </w:tc>
@@ -3140,7 +3140,7 @@
                 <w:sz w:val="19"/>
                 <w:szCs w:val="19"/>
               </w:rPr>
-              <w:t xml:space="preserve">2027 차량 1대 추가</w:t>
+              <w:t xml:space="preserve">차량 렌트 보증금 없음</w:t>
             </w:r>
           </w:p>
         </w:tc>
@@ -5012,7 +5012,7 @@
           <w:sz w:val="22"/>
           <w:szCs w:val="22"/>
         </w:rPr>
-        <w:t xml:space="preserve">ㅇ 파견·차량: 원격 교통비 64.5/인·월, 차량 렌트 36/대·월, 차량 운영 30/대·월, 파견수당 30/인·월</w:t>
+        <w:t xml:space="preserve">ㅇ 파견·차량: 원격 교통비 64.5/인·월, 차량 렌트 50/월(1년 계약, 보증금 없음), 차량 운영 30/월, 파견수당 30/인·월 — 차량 1대</w:t>
       </w:r>
     </w:p>
     <w:p>
@@ -5631,6 +5631,7 @@
               <w:bottom w:val="single" w:color="808080" w:sz="4"/>
               <w:right w:val="single" w:color="808080" w:sz="4"/>
             </w:tcBorders>
+            <w:shd w:fill="FFF2CC" w:color="auto" w:val="clear"/>
             <w:tcMar>
               <w:top w:type="dxa" w:w="50"/>
               <w:left w:type="dxa" w:w="90"/>
@@ -5647,10 +5648,12 @@
             <w:r>
               <w:rPr>
                 <w:rFonts w:ascii="맑은 고딕" w:cs="맑은 고딕" w:eastAsia="맑은 고딕" w:hAnsi="맑은 고딕"/>
-                <w:sz w:val="19"/>
-                <w:szCs w:val="19"/>
-              </w:rPr>
-              <w:t xml:space="preserve">차량 렌트 보증금 (1대)</w:t>
+                <w:b/>
+                <w:bCs/>
+                <w:sz w:val="19"/>
+                <w:szCs w:val="19"/>
+              </w:rPr>
+              <w:t xml:space="preserve">2026 보증금 소계</w:t>
             </w:r>
           </w:p>
         </w:tc>
@@ -5663,6 +5666,7 @@
               <w:bottom w:val="single" w:color="808080" w:sz="4"/>
               <w:right w:val="single" w:color="808080" w:sz="4"/>
             </w:tcBorders>
+            <w:shd w:fill="FFF2CC" w:color="auto" w:val="clear"/>
             <w:tcMar>
               <w:top w:type="dxa" w:w="50"/>
               <w:left w:type="dxa" w:w="90"/>
@@ -5679,10 +5683,12 @@
             <w:r>
               <w:rPr>
                 <w:rFonts w:ascii="맑은 고딕" w:cs="맑은 고딕" w:eastAsia="맑은 고딕" w:hAnsi="맑은 고딕"/>
-                <w:sz w:val="19"/>
-                <w:szCs w:val="19"/>
-              </w:rPr>
-              <w:t xml:space="preserve">≤ 900.0</w:t>
+                <w:b/>
+                <w:bCs/>
+                <w:sz w:val="19"/>
+                <w:szCs w:val="19"/>
+              </w:rPr>
+              <w:t xml:space="preserve">5,352.2</w:t>
             </w:r>
           </w:p>
         </w:tc>
@@ -5695,26 +5701,27 @@
               <w:bottom w:val="single" w:color="808080" w:sz="4"/>
               <w:right w:val="single" w:color="808080" w:sz="4"/>
             </w:tcBorders>
-            <w:tcMar>
-              <w:top w:type="dxa" w:w="50"/>
-              <w:left w:type="dxa" w:w="90"/>
-              <w:bottom w:type="dxa" w:w="50"/>
-              <w:right w:type="dxa" w:w="90"/>
-            </w:tcMar>
-            <w:vAlign w:val="center"/>
-          </w:tcPr>
-          <w:p>
-            <w:pPr>
-              <w:spacing w:after="0"/>
-              <w:jc w:val="center"/>
-            </w:pPr>
-            <w:r>
-              <w:rPr>
-                <w:rFonts w:ascii="맑은 고딕" w:cs="맑은 고딕" w:eastAsia="맑은 고딕" w:hAnsi="맑은 고딕"/>
-                <w:sz w:val="19"/>
-                <w:szCs w:val="19"/>
-              </w:rPr>
-              <w:t xml:space="preserve">2026.11</w:t>
+            <w:shd w:fill="FFF2CC" w:color="auto" w:val="clear"/>
+            <w:tcMar>
+              <w:top w:type="dxa" w:w="50"/>
+              <w:left w:type="dxa" w:w="90"/>
+              <w:bottom w:type="dxa" w:w="50"/>
+              <w:right w:type="dxa" w:w="90"/>
+            </w:tcMar>
+            <w:vAlign w:val="center"/>
+          </w:tcPr>
+          <w:p>
+            <w:pPr>
+              <w:spacing w:after="0"/>
+              <w:jc w:val="left"/>
+            </w:pPr>
+            <w:r>
+              <w:rPr>
+                <w:rFonts w:ascii="맑은 고딕" w:cs="맑은 고딕" w:eastAsia="맑은 고딕" w:hAnsi="맑은 고딕"/>
+                <w:sz w:val="19"/>
+                <w:szCs w:val="19"/>
+              </w:rPr>
+              <w:t xml:space="preserve"/>
             </w:r>
           </w:p>
         </w:tc>
@@ -5727,6 +5734,7 @@
               <w:bottom w:val="single" w:color="808080" w:sz="4"/>
               <w:right w:val="single" w:color="808080" w:sz="4"/>
             </w:tcBorders>
+            <w:shd w:fill="FFF2CC" w:color="auto" w:val="clear"/>
             <w:tcMar>
               <w:top w:type="dxa" w:w="50"/>
               <w:left w:type="dxa" w:w="90"/>
@@ -5746,7 +5754,7 @@
                 <w:sz w:val="19"/>
                 <w:szCs w:val="19"/>
               </w:rPr>
-              <w:t xml:space="preserve">차량가 30% (700~900 중 상한)</w:t>
+              <w:t xml:space="preserve"/>
             </w:r>
           </w:p>
         </w:tc>
@@ -5764,7 +5772,6 @@
               <w:bottom w:val="single" w:color="808080" w:sz="4"/>
               <w:right w:val="single" w:color="808080" w:sz="4"/>
             </w:tcBorders>
-            <w:shd w:fill="FFF2CC" w:color="auto" w:val="clear"/>
             <w:tcMar>
               <w:top w:type="dxa" w:w="50"/>
               <w:left w:type="dxa" w:w="90"/>
@@ -5781,12 +5788,10 @@
             <w:r>
               <w:rPr>
                 <w:rFonts w:ascii="맑은 고딕" w:cs="맑은 고딕" w:eastAsia="맑은 고딕" w:hAnsi="맑은 고딕"/>
-                <w:b/>
-                <w:bCs/>
-                <w:sz w:val="19"/>
-                <w:szCs w:val="19"/>
-              </w:rPr>
-              <w:t xml:space="preserve">2026 보증금 소계</w:t>
+                <w:sz w:val="19"/>
+                <w:szCs w:val="19"/>
+              </w:rPr>
+              <w:t xml:space="preserve">차량 렌트 보증금</w:t>
             </w:r>
           </w:p>
         </w:tc>
@@ -5799,7 +5804,6 @@
               <w:bottom w:val="single" w:color="808080" w:sz="4"/>
               <w:right w:val="single" w:color="808080" w:sz="4"/>
             </w:tcBorders>
-            <w:shd w:fill="FFF2CC" w:color="auto" w:val="clear"/>
             <w:tcMar>
               <w:top w:type="dxa" w:w="50"/>
               <w:left w:type="dxa" w:w="90"/>
@@ -5816,12 +5820,10 @@
             <w:r>
               <w:rPr>
                 <w:rFonts w:ascii="맑은 고딕" w:cs="맑은 고딕" w:eastAsia="맑은 고딕" w:hAnsi="맑은 고딕"/>
-                <w:b/>
-                <w:bCs/>
-                <w:sz w:val="19"/>
-                <w:szCs w:val="19"/>
-              </w:rPr>
-              <w:t xml:space="preserve">6,252.2</w:t>
+                <w:sz w:val="19"/>
+                <w:szCs w:val="19"/>
+              </w:rPr>
+              <w:t xml:space="preserve">–</w:t>
             </w:r>
           </w:p>
         </w:tc>
@@ -5834,7 +5836,38 @@
               <w:bottom w:val="single" w:color="808080" w:sz="4"/>
               <w:right w:val="single" w:color="808080" w:sz="4"/>
             </w:tcBorders>
-            <w:shd w:fill="FFF2CC" w:color="auto" w:val="clear"/>
+            <w:tcMar>
+              <w:top w:type="dxa" w:w="50"/>
+              <w:left w:type="dxa" w:w="90"/>
+              <w:bottom w:type="dxa" w:w="50"/>
+              <w:right w:type="dxa" w:w="90"/>
+            </w:tcMar>
+            <w:vAlign w:val="center"/>
+          </w:tcPr>
+          <w:p>
+            <w:pPr>
+              <w:spacing w:after="0"/>
+              <w:jc w:val="center"/>
+            </w:pPr>
+            <w:r>
+              <w:rPr>
+                <w:rFonts w:ascii="맑은 고딕" w:cs="맑은 고딕" w:eastAsia="맑은 고딕" w:hAnsi="맑은 고딕"/>
+                <w:sz w:val="19"/>
+                <w:szCs w:val="19"/>
+              </w:rPr>
+              <w:t xml:space="preserve">–</w:t>
+            </w:r>
+          </w:p>
+        </w:tc>
+        <w:tc>
+          <w:tcPr>
+            <w:tcW w:type="dxa" w:w="4038"/>
+            <w:tcBorders>
+              <w:top w:val="single" w:color="808080" w:sz="4"/>
+              <w:left w:val="single" w:color="808080" w:sz="4"/>
+              <w:bottom w:val="single" w:color="808080" w:sz="4"/>
+              <w:right w:val="single" w:color="808080" w:sz="4"/>
+            </w:tcBorders>
             <w:tcMar>
               <w:top w:type="dxa" w:w="50"/>
               <w:left w:type="dxa" w:w="90"/>
@@ -5854,173 +5887,7 @@
                 <w:sz w:val="19"/>
                 <w:szCs w:val="19"/>
               </w:rPr>
-              <w:t xml:space="preserve"/>
-            </w:r>
-          </w:p>
-        </w:tc>
-        <w:tc>
-          <w:tcPr>
-            <w:tcW w:type="dxa" w:w="4038"/>
-            <w:tcBorders>
-              <w:top w:val="single" w:color="808080" w:sz="4"/>
-              <w:left w:val="single" w:color="808080" w:sz="4"/>
-              <w:bottom w:val="single" w:color="808080" w:sz="4"/>
-              <w:right w:val="single" w:color="808080" w:sz="4"/>
-            </w:tcBorders>
-            <w:shd w:fill="FFF2CC" w:color="auto" w:val="clear"/>
-            <w:tcMar>
-              <w:top w:type="dxa" w:w="50"/>
-              <w:left w:type="dxa" w:w="90"/>
-              <w:bottom w:type="dxa" w:w="50"/>
-              <w:right w:type="dxa" w:w="90"/>
-            </w:tcMar>
-            <w:vAlign w:val="center"/>
-          </w:tcPr>
-          <w:p>
-            <w:pPr>
-              <w:spacing w:after="0"/>
-              <w:jc w:val="left"/>
-            </w:pPr>
-            <w:r>
-              <w:rPr>
-                <w:rFonts w:ascii="맑은 고딕" w:cs="맑은 고딕" w:eastAsia="맑은 고딕" w:hAnsi="맑은 고딕"/>
-                <w:sz w:val="19"/>
-                <w:szCs w:val="19"/>
-              </w:rPr>
-              <w:t xml:space="preserve"/>
-            </w:r>
-          </w:p>
-        </w:tc>
-      </w:tr>
-      <w:tr>
-        <w:trPr>
-          <w:tblHeader w:val="false"/>
-        </w:trPr>
-        <w:tc>
-          <w:tcPr>
-            <w:tcW w:type="dxa" w:w="2900"/>
-            <w:tcBorders>
-              <w:top w:val="single" w:color="808080" w:sz="4"/>
-              <w:left w:val="single" w:color="808080" w:sz="4"/>
-              <w:bottom w:val="single" w:color="808080" w:sz="4"/>
-              <w:right w:val="single" w:color="808080" w:sz="4"/>
-            </w:tcBorders>
-            <w:tcMar>
-              <w:top w:type="dxa" w:w="50"/>
-              <w:left w:type="dxa" w:w="90"/>
-              <w:bottom w:type="dxa" w:w="50"/>
-              <w:right w:type="dxa" w:w="90"/>
-            </w:tcMar>
-            <w:vAlign w:val="center"/>
-          </w:tcPr>
-          <w:p>
-            <w:pPr>
-              <w:spacing w:after="0"/>
-              <w:jc w:val="left"/>
-            </w:pPr>
-            <w:r>
-              <w:rPr>
-                <w:rFonts w:ascii="맑은 고딕" w:cs="맑은 고딕" w:eastAsia="맑은 고딕" w:hAnsi="맑은 고딕"/>
-                <w:sz w:val="19"/>
-                <w:szCs w:val="19"/>
-              </w:rPr>
-              <w:t xml:space="preserve">차량 렌트 보증금 (추가 1대)</w:t>
-            </w:r>
-          </w:p>
-        </w:tc>
-        <w:tc>
-          <w:tcPr>
-            <w:tcW w:type="dxa" w:w="1400"/>
-            <w:tcBorders>
-              <w:top w:val="single" w:color="808080" w:sz="4"/>
-              <w:left w:val="single" w:color="808080" w:sz="4"/>
-              <w:bottom w:val="single" w:color="808080" w:sz="4"/>
-              <w:right w:val="single" w:color="808080" w:sz="4"/>
-            </w:tcBorders>
-            <w:tcMar>
-              <w:top w:type="dxa" w:w="50"/>
-              <w:left w:type="dxa" w:w="90"/>
-              <w:bottom w:type="dxa" w:w="50"/>
-              <w:right w:type="dxa" w:w="90"/>
-            </w:tcMar>
-            <w:vAlign w:val="center"/>
-          </w:tcPr>
-          <w:p>
-            <w:pPr>
-              <w:spacing w:after="0"/>
-              <w:jc w:val="right"/>
-            </w:pPr>
-            <w:r>
-              <w:rPr>
-                <w:rFonts w:ascii="맑은 고딕" w:cs="맑은 고딕" w:eastAsia="맑은 고딕" w:hAnsi="맑은 고딕"/>
-                <w:sz w:val="19"/>
-                <w:szCs w:val="19"/>
-              </w:rPr>
-              <w:t xml:space="preserve">≤ 900.0</w:t>
-            </w:r>
-          </w:p>
-        </w:tc>
-        <w:tc>
-          <w:tcPr>
-            <w:tcW w:type="dxa" w:w="1300"/>
-            <w:tcBorders>
-              <w:top w:val="single" w:color="808080" w:sz="4"/>
-              <w:left w:val="single" w:color="808080" w:sz="4"/>
-              <w:bottom w:val="single" w:color="808080" w:sz="4"/>
-              <w:right w:val="single" w:color="808080" w:sz="4"/>
-            </w:tcBorders>
-            <w:tcMar>
-              <w:top w:type="dxa" w:w="50"/>
-              <w:left w:type="dxa" w:w="90"/>
-              <w:bottom w:type="dxa" w:w="50"/>
-              <w:right w:type="dxa" w:w="90"/>
-            </w:tcMar>
-            <w:vAlign w:val="center"/>
-          </w:tcPr>
-          <w:p>
-            <w:pPr>
-              <w:spacing w:after="0"/>
-              <w:jc w:val="center"/>
-            </w:pPr>
-            <w:r>
-              <w:rPr>
-                <w:rFonts w:ascii="맑은 고딕" w:cs="맑은 고딕" w:eastAsia="맑은 고딕" w:hAnsi="맑은 고딕"/>
-                <w:sz w:val="19"/>
-                <w:szCs w:val="19"/>
-              </w:rPr>
-              <w:t xml:space="preserve">2027.1Q</w:t>
-            </w:r>
-          </w:p>
-        </w:tc>
-        <w:tc>
-          <w:tcPr>
-            <w:tcW w:type="dxa" w:w="4038"/>
-            <w:tcBorders>
-              <w:top w:val="single" w:color="808080" w:sz="4"/>
-              <w:left w:val="single" w:color="808080" w:sz="4"/>
-              <w:bottom w:val="single" w:color="808080" w:sz="4"/>
-              <w:right w:val="single" w:color="808080" w:sz="4"/>
-            </w:tcBorders>
-            <w:tcMar>
-              <w:top w:type="dxa" w:w="50"/>
-              <w:left w:type="dxa" w:w="90"/>
-              <w:bottom w:type="dxa" w:w="50"/>
-              <w:right w:type="dxa" w:w="90"/>
-            </w:tcMar>
-            <w:vAlign w:val="center"/>
-          </w:tcPr>
-          <w:p>
-            <w:pPr>
-              <w:spacing w:after="0"/>
-              <w:jc w:val="left"/>
-            </w:pPr>
-            <w:r>
-              <w:rPr>
-                <w:rFonts w:ascii="맑은 고딕" w:cs="맑은 고딕" w:eastAsia="맑은 고딕" w:hAnsi="맑은 고딕"/>
-                <w:sz w:val="19"/>
-                <w:szCs w:val="19"/>
-              </w:rPr>
-              <w:t xml:space="preserve">수석 엔지니어 파견 시</w:t>
+              <w:t xml:space="preserve">1년 렌트 계약 월 50만 원 — 보증금 없음</w:t>
             </w:r>
           </w:p>
         </w:tc>
@@ -6147,7 +6014,7 @@
           <w:sz w:val="22"/>
           <w:szCs w:val="22"/>
         </w:rPr>
-        <w:t xml:space="preserve">ㅇ 2026.11 상순  사무실·숙소 계약, 보증금 지급, 차량 렌트 계약</w:t>
+        <w:t xml:space="preserve">ㅇ 2026.11 상순  사무실·숙소 계약, 보증금 지급, 차량 1년 렌트 계약(1대)</w:t>
       </w:r>
     </w:p>
     <w:p>
@@ -6162,20 +6029,6 @@
           <w:szCs w:val="22"/>
         </w:rPr>
         <w:t xml:space="preserve">ㅇ 2026.11 중순  집기·비품 설치, 숙소 입주</w:t>
-      </w:r>
-    </w:p>
-    <w:p>
-      <w:pPr>
-        <w:spacing w:after="60" w:before="0" w:line="300"/>
-        <w:ind w:left="560" w:hanging="260"/>
-      </w:pPr>
-      <w:r>
-        <w:rPr>
-          <w:rFonts w:ascii="맑은 고딕" w:cs="맑은 고딕" w:eastAsia="맑은 고딕" w:hAnsi="맑은 고딕"/>
-          <w:sz w:val="22"/>
-          <w:szCs w:val="22"/>
-        </w:rPr>
-        <w:t xml:space="preserve">ㅇ 2027.1/4분기  차량 1대 추가 렌트(수석 엔지니어 파견)</w:t>
       </w:r>
     </w:p>
     <w:p>
@@ -6273,7 +6126,7 @@
           <w:sz w:val="22"/>
           <w:szCs w:val="22"/>
         </w:rPr>
-        <w:t xml:space="preserve">ㅇ 2027년 거점 영업손익(인건비 포함) 계획 +1.60억 원 — 손익분기 매출은 계획의 62%</w:t>
+        <w:t xml:space="preserve">ㅇ 2027년 거점 영업손익(인건비 포함) 계획 +1.66억 원 — 손익분기 매출은 계획의 61%</w:t>
       </w:r>
     </w:p>
     <w:p>
@@ -6303,7 +6156,7 @@
           <w:sz w:val="22"/>
           <w:szCs w:val="22"/>
         </w:rPr>
-        <w:t xml:space="preserve">ㅇ 계획서(v10) 대비 사무실 운영비 2027 +77만 원(임대료 VAT 포함·렌탈 세분화), 사무 집기 +131~431만 원(체크리스트 반영)</w:t>
+        <w:t xml:space="preserve">ㅇ 계획서(v11) 대비 사무실 운영비 2027 +77만 원(임대료 VAT 포함·렌탈 세분화), 사무 집기 +131~431만 원(체크리스트 반영)</w:t>
       </w:r>
     </w:p>
     <w:p>
@@ -6331,7 +6184,7 @@
           <w:sz w:val="22"/>
           <w:szCs w:val="22"/>
         </w:rPr>
-        <w:t xml:space="preserve">ㅇ 집행 전 확정: 차량 보증금 대당 금액, 숙소 옵션 가전 여부(최대 179만 원 감소), 사무실·숙소 관리비 실제 부과액</w:t>
+        <w:t xml:space="preserve">ㅇ 집행 전 확정: 차량 렌트 계약 조건(보험·정비 포함 여부), 숙소 옵션 가전 여부(최대 179만 원 감소), 사무실·숙소 관리비 실제 부과액</w:t>
       </w:r>
     </w:p>
     <w:p>

</xml_diff>

<commit_message>
Switch housing setup cost to standard tier across approval docs and plan v11
Co-Authored-By: Claude Opus 5.5 <noreply@anthropic.com>
Claude-Session: https://claude.ai/code/session_01SrTScNKmsHS34birk48N5j
</commit_message>
<xml_diff>
--- a/output/changwon_budget_request.docx
+++ b/output/changwon_budget_request.docx
@@ -1108,7 +1108,7 @@
           <w:sz w:val="22"/>
           <w:szCs w:val="22"/>
         </w:rPr>
-        <w:t xml:space="preserve">2026년 집행 예산 : 2,891만 원 (비용) + 보증금 5,352만 원 (반환 자산)</w:t>
+        <w:t xml:space="preserve">2026년 집행 예산 : 3,321만 원 (비용) + 보증금 5,352만 원 (반환 자산)</w:t>
       </w:r>
     </w:p>
     <w:p>
@@ -1122,7 +1122,7 @@
           <w:sz w:val="22"/>
           <w:szCs w:val="22"/>
         </w:rPr>
-        <w:t xml:space="preserve">ㅇ 일회성 초기 투자 1,943만 원 + 11~12월 운영비 948만 원</w:t>
+        <w:t xml:space="preserve">ㅇ 일회성 초기 투자 2,373만 원 + 11~12월 운영비 948만 원</w:t>
       </w:r>
     </w:p>
     <w:p>
@@ -1136,7 +1136,7 @@
           <w:sz w:val="22"/>
           <w:szCs w:val="22"/>
         </w:rPr>
-        <w:t xml:space="preserve">ㅇ 2026년 현금 소요 합계 8,243만 원 (2026.11 입주 시점 집중)</w:t>
+        <w:t xml:space="preserve">ㅇ 2026년 현금 소요 합계 8,673만 원 (2026.11 입주 시점 집중)</w:t>
       </w:r>
     </w:p>
     <w:p>
@@ -1667,7 +1667,7 @@
                 <w:sz w:val="19"/>
                 <w:szCs w:val="19"/>
               </w:rPr>
-              <w:t xml:space="preserve">숙소 초기 설치 (실속안)</w:t>
+              <w:t xml:space="preserve">숙소 초기 설치 (표준안)</w:t>
             </w:r>
           </w:p>
         </w:tc>
@@ -1699,7 +1699,7 @@
                 <w:sz w:val="19"/>
                 <w:szCs w:val="19"/>
               </w:rPr>
-              <w:t xml:space="preserve">611</w:t>
+              <w:t xml:space="preserve">1,041</w:t>
             </w:r>
           </w:p>
         </w:tc>
@@ -2664,7 +2664,7 @@
                 <w:sz w:val="19"/>
                 <w:szCs w:val="19"/>
               </w:rPr>
-              <w:t xml:space="preserve">2,891</w:t>
+              <w:t xml:space="preserve">3,321</w:t>
             </w:r>
           </w:p>
         </w:tc>
@@ -4637,7 +4637,7 @@
                 <w:sz w:val="19"/>
                 <w:szCs w:val="19"/>
               </w:rPr>
-              <w:t xml:space="preserve">숙소 초기 설치 (실속안)</w:t>
+              <w:t xml:space="preserve">숙소 초기 설치 (표준안)</w:t>
             </w:r>
           </w:p>
         </w:tc>
@@ -4735,7 +4735,7 @@
                 <w:sz w:val="19"/>
                 <w:szCs w:val="19"/>
               </w:rPr>
-              <w:t xml:space="preserve">611.4</w:t>
+              <w:t xml:space="preserve">1,041.4</w:t>
             </w:r>
           </w:p>
         </w:tc>
@@ -4767,7 +4767,7 @@
                 <w:sz w:val="19"/>
                 <w:szCs w:val="19"/>
               </w:rPr>
-              <w:t xml:space="preserve">거실 95 · 침실 126 · 커튼 50 · 가전 244.4 · 계약 66 · 생활 30</w:t>
+              <w:t xml:space="preserve">거실 190 · 침실 280 · 커튼 104.5 · 가전 340.9 · 계약 66 · 생활 60</w:t>
             </w:r>
           </w:p>
         </w:tc>
@@ -4908,7 +4908,7 @@
                 <w:sz w:val="19"/>
                 <w:szCs w:val="19"/>
               </w:rPr>
-              <w:t xml:space="preserve">1,942.6</w:t>
+              <w:t xml:space="preserve">2,372.6</w:t>
             </w:r>
           </w:p>
         </w:tc>
@@ -5960,7 +5960,7 @@
           <w:sz w:val="22"/>
           <w:szCs w:val="22"/>
         </w:rPr>
-        <w:t xml:space="preserve">ㅇ 숙소: 임대차 계약 후 가구·가전 구매, 임대 옵션 포함 품목은 구매 제외</w:t>
+        <w:t xml:space="preserve">ㅇ 숙소: 임대차 계약 후 가구·가전 구매(표준안 한도), 임대 옵션 포함 품목은 구매 제외</w:t>
       </w:r>
     </w:p>
     <w:p>
@@ -6170,7 +6170,7 @@
           <w:sz w:val="22"/>
           <w:szCs w:val="22"/>
         </w:rPr>
-        <w:t xml:space="preserve">ㅇ 계획서 2026 일회성 비용 0.11억에 사무 집기가 빠져 있어, 본 품의 기준(0.19억) 반영 시 2026 거점 영업손익 약 (0.42)억</w:t>
+        <w:t xml:space="preserve">ㅇ 계획서 2026 일회성 비용 0.15억에 사무 집기가 빠져 있어, 본 품의 기준(0.24억) 반영 시 2026 거점 영업손익 약 (0.46)억</w:t>
       </w:r>
     </w:p>
     <w:p>
@@ -6184,7 +6184,7 @@
           <w:sz w:val="22"/>
           <w:szCs w:val="22"/>
         </w:rPr>
-        <w:t xml:space="preserve">ㅇ 집행 전 확정: 차량 렌트 계약 조건(보험·정비 포함 여부), 숙소 옵션 가전 여부(최대 179만 원 감소), 사무실·숙소 관리비 실제 부과액</w:t>
+        <w:t xml:space="preserve">ㅇ 집행 전 확정: 차량 렌트 계약 조건(보험·정비 포함 여부), 숙소 옵션 가전 여부(최대 206만 원 감소), 사무실·숙소 관리비 실제 부과액</w:t>
       </w:r>
     </w:p>
     <w:p>

</xml_diff>

<commit_message>
Reflect office furniture in plan v11 one-time cost; sync approval docs
Co-Authored-By: Claude Opus 5.5 <noreply@anthropic.com>
Claude-Session: https://claude.ai/code/session_01SrTScNKmsHS34birk48N5j
</commit_message>
<xml_diff>
--- a/output/changwon_budget_request.docx
+++ b/output/changwon_budget_request.docx
@@ -6156,7 +6156,7 @@
           <w:sz w:val="22"/>
           <w:szCs w:val="22"/>
         </w:rPr>
-        <w:t xml:space="preserve">ㅇ 계획서(v11) 대비 사무실 운영비 2027 +77만 원(임대료 VAT 포함·렌탈 세분화), 사무 집기 +131~431만 원(체크리스트 반영)</w:t>
+        <w:t xml:space="preserve">ㅇ 계획서(v11) 대비 차이는 사무실 운영비뿐 — 2027 +77만 원, 2026 +52만 원(임대료 VAT 포함·렌탈 세분화)</w:t>
       </w:r>
     </w:p>
     <w:p>
@@ -6170,7 +6170,7 @@
           <w:sz w:val="22"/>
           <w:szCs w:val="22"/>
         </w:rPr>
-        <w:t xml:space="preserve">ㅇ 계획서 2026 일회성 비용 0.15억에 사무 집기가 빠져 있어, 본 품의 기준(0.24억) 반영 시 2026 거점 영업손익 약 (0.46)억</w:t>
+        <w:t xml:space="preserve">ㅇ 계획서(v11)에 본 품의 일회성 비용 0.24억(사무 집기·숙소 설치) 반영 — 2026 거점 영업손익 (0.46)억, 3개년 누적 +7.33억</w:t>
       </w:r>
     </w:p>
     <w:p>

</xml_diff>